<commit_message>
Update File dan Isi Proposal
</commit_message>
<xml_diff>
--- a/Mungkin Fix/Requirement/SURAT PERNYATAAN DOSEN PENGUJI UNTUK REVISI.docx
+++ b/Mungkin Fix/Requirement/SURAT PERNYATAAN DOSEN PENGUJI UNTUK REVISI.docx
@@ -368,35 +368,60 @@
         <w:rPr>
           <w:b/>
         </w:rPr>
-        <w:tab/>
+        <w:t xml:space="preserve"> </w:t>
+      </w:r>
+      <w:r>
+        <w:rPr>
+          <w:b/>
+        </w:rPr>
         <w:t>TUGAS</w:t>
       </w:r>
       <w:r>
         <w:rPr>
           <w:b/>
         </w:rPr>
-        <w:tab/>
+        <w:t xml:space="preserve"> </w:t>
+      </w:r>
+      <w:r>
+        <w:rPr>
+          <w:b/>
+        </w:rPr>
         <w:t>AKHIR</w:t>
       </w:r>
       <w:r>
         <w:rPr>
           <w:b/>
         </w:rPr>
-        <w:tab/>
+        <w:t xml:space="preserve"> </w:t>
+      </w:r>
+      <w:r>
+        <w:rPr>
+          <w:b/>
+        </w:rPr>
         <w:t>(TA)</w:t>
       </w:r>
       <w:r>
         <w:rPr>
           <w:b/>
         </w:rPr>
-        <w:tab/>
+        <w:t xml:space="preserve"> </w:t>
+      </w:r>
+      <w:r>
+        <w:rPr>
+          <w:b/>
+        </w:rPr>
         <w:t>–</w:t>
       </w:r>
       <w:r>
         <w:rPr>
           <w:b/>
         </w:rPr>
-        <w:tab/>
+        <w:t xml:space="preserve"> </w:t>
+      </w:r>
+      <w:r>
+        <w:rPr>
+          <w:b/>
+        </w:rPr>
         <w:t>1</w:t>
       </w:r>
       <w:r>
@@ -424,91 +449,120 @@
         <w:t>KAMI</w:t>
       </w:r>
       <w:r>
-        <w:tab/>
+        <w:t xml:space="preserve"> </w:t>
+      </w:r>
+      <w:r>
         <w:t>YANG</w:t>
       </w:r>
       <w:r>
-        <w:tab/>
-        <w:t>BERTANDATANGAN</w:t>
-      </w:r>
-      <w:r>
-        <w:tab/>
+        <w:t xml:space="preserve"> </w:t>
+      </w:r>
+      <w:r>
+        <w:t>BERTANDA</w:t>
+      </w:r>
+      <w:r>
+        <w:t xml:space="preserve"> </w:t>
+      </w:r>
+      <w:r>
+        <w:t>TANGAN</w:t>
+      </w:r>
+      <w:r>
+        <w:t xml:space="preserve"> </w:t>
+      </w:r>
+      <w:r>
         <w:t>DI</w:t>
       </w:r>
       <w:r>
-        <w:tab/>
+        <w:t xml:space="preserve"> </w:t>
+      </w:r>
+      <w:r>
         <w:t>BAWAH</w:t>
       </w:r>
       <w:r>
-        <w:tab/>
+        <w:t xml:space="preserve"> </w:t>
+      </w:r>
+      <w:r>
         <w:t>INI</w:t>
       </w:r>
       <w:r>
-        <w:tab/>
+        <w:t xml:space="preserve"> </w:t>
+      </w:r>
+      <w:r>
         <w:t>SEBAGAI</w:t>
       </w:r>
       <w:r>
-        <w:tab/>
+        <w:t xml:space="preserve"> </w:t>
+      </w:r>
+      <w:r>
         <w:t>DOSEN</w:t>
       </w:r>
       <w:r>
-        <w:tab/>
+        <w:t xml:space="preserve"> </w:t>
+      </w:r>
+      <w:r>
         <w:t>PENGUJI</w:t>
       </w:r>
       <w:r>
-        <w:tab/>
+        <w:t xml:space="preserve"> </w:t>
+      </w:r>
+      <w:r>
         <w:t>1</w:t>
       </w:r>
       <w:r>
-        <w:tab/>
+        <w:t xml:space="preserve"> </w:t>
+      </w:r>
+      <w:r>
         <w:t>DAN</w:t>
       </w:r>
       <w:r>
-        <w:tab/>
+        <w:t xml:space="preserve"> </w:t>
+      </w:r>
+      <w:r>
         <w:t>2</w:t>
       </w:r>
       <w:r>
-        <w:tab/>
-        <w:t>BAHWA</w:t>
+        <w:t xml:space="preserve"> </w:t>
+      </w:r>
+      <w:r>
+        <w:t>BAHW</w:t>
+      </w:r>
+      <w:r>
+        <w:t xml:space="preserve"> </w:t>
       </w:r>
       <w:r>
         <w:tab/>
         <w:t>MAHASISWA</w:t>
       </w:r>
       <w:r>
-        <w:tab/>
+        <w:t xml:space="preserve"> </w:t>
+      </w:r>
+      <w:r>
         <w:t>PESERTA</w:t>
       </w:r>
       <w:r>
-        <w:tab/>
+        <w:t xml:space="preserve"> </w:t>
+      </w:r>
+      <w:r>
         <w:t>SEMINAR</w:t>
       </w:r>
       <w:r>
-        <w:tab/>
+        <w:t xml:space="preserve"> </w:t>
+      </w:r>
+      <w:r>
         <w:t>TA-1</w:t>
       </w:r>
       <w:r>
-        <w:tab/>
+        <w:t xml:space="preserve"> </w:t>
+      </w:r>
+      <w:r>
         <w:t>BERIKUT</w:t>
       </w:r>
       <w:r>
-        <w:tab/>
-        <w:t>INI</w:t>
-      </w:r>
-      <w:r>
-        <w:tab/>
-        <w:t>:</w:t>
-      </w:r>
-      <w:r>
-        <w:tab/>
-      </w:r>
-    </w:p>
-    <w:p>
-      <w:pPr>
-        <w:spacing w:after="160" w:line="259" w:lineRule="auto"/>
-        <w:ind w:left="0" w:firstLine="0"/>
-        <w:jc w:val="left"/>
-      </w:pPr>
+        <w:t xml:space="preserve"> </w:t>
+      </w:r>
+      <w:r>
+        <w:t>INI:</w:t>
+      </w:r>
       <w:r>
         <w:tab/>
       </w:r>
@@ -968,8 +1022,7 @@
     <w:p>
       <w:pPr>
         <w:spacing w:after="155" w:line="259" w:lineRule="auto"/>
-        <w:ind w:left="6480" w:right="105" w:firstLine="608"/>
-        <w:jc w:val="center"/>
+        <w:ind w:left="6480" w:right="105" w:firstLine="324"/>
       </w:pPr>
       <w:r>
         <w:t>CIMAHI,</w:t>
@@ -993,9 +1046,6 @@
         <w:ind w:left="0" w:firstLine="0"/>
         <w:jc w:val="left"/>
       </w:pPr>
-      <w:r>
-        <w:tab/>
-      </w:r>
       <w:r>
         <w:tab/>
       </w:r>
@@ -1067,8 +1117,6 @@
       </w:pPr>
       <w:r>
         <w:tab/>
-      </w:r>
-      <w:r>
         <w:t>PENGUJI-1</w:t>
       </w:r>
       <w:r>
@@ -1104,22 +1152,130 @@
     </w:p>
     <w:p>
       <w:pPr>
-        <w:spacing w:after="155" w:line="259" w:lineRule="auto"/>
-        <w:ind w:left="0" w:firstLine="0"/>
-        <w:jc w:val="left"/>
-      </w:pPr>
-      <w:r>
-        <w:tab/>
-      </w:r>
-    </w:p>
-    <w:p>
-      <w:pPr>
+        <w:tabs>
+          <w:tab w:val="left" w:pos="6804"/>
+        </w:tabs>
         <w:spacing w:after="160" w:line="259" w:lineRule="auto"/>
         <w:ind w:left="0" w:firstLine="0"/>
         <w:jc w:val="left"/>
       </w:pPr>
       <w:r>
-        <w:tab/>
+        <w:rPr>
+          <w:noProof/>
+        </w:rPr>
+        <w:t xml:space="preserve">   </w:t>
+      </w:r>
+      <w:r>
+        <w:rPr>
+          <w:noProof/>
+        </w:rPr>
+        <w:drawing>
+          <wp:inline distT="0" distB="0" distL="0" distR="0" wp14:anchorId="3F0DC550" wp14:editId="35079DA3">
+            <wp:extent cx="990600" cy="990600"/>
+            <wp:effectExtent l="0" t="0" r="0" b="0"/>
+            <wp:docPr id="973489152" name="Picture 8"/>
+            <wp:cNvGraphicFramePr>
+              <a:graphicFrameLocks xmlns:a="http://schemas.openxmlformats.org/drawingml/2006/main" noChangeAspect="1"/>
+            </wp:cNvGraphicFramePr>
+            <a:graphic xmlns:a="http://schemas.openxmlformats.org/drawingml/2006/main">
+              <a:graphicData uri="http://schemas.openxmlformats.org/drawingml/2006/picture">
+                <pic:pic xmlns:pic="http://schemas.openxmlformats.org/drawingml/2006/picture">
+                  <pic:nvPicPr>
+                    <pic:cNvPr id="0" name="Picture 3"/>
+                    <pic:cNvPicPr>
+                      <a:picLocks noChangeAspect="1" noChangeArrowheads="1"/>
+                    </pic:cNvPicPr>
+                  </pic:nvPicPr>
+                  <pic:blipFill>
+                    <a:blip r:embed="rId6" cstate="print">
+                      <a:extLst>
+                        <a:ext uri="{28A0092B-C50C-407E-A947-70E740481C1C}">
+                          <a14:useLocalDpi xmlns:a14="http://schemas.microsoft.com/office/drawing/2010/main" val="0"/>
+                        </a:ext>
+                      </a:extLst>
+                    </a:blip>
+                    <a:srcRect/>
+                    <a:stretch>
+                      <a:fillRect/>
+                    </a:stretch>
+                  </pic:blipFill>
+                  <pic:spPr bwMode="auto">
+                    <a:xfrm>
+                      <a:off x="0" y="0"/>
+                      <a:ext cx="990600" cy="990600"/>
+                    </a:xfrm>
+                    <a:prstGeom prst="rect">
+                      <a:avLst/>
+                    </a:prstGeom>
+                    <a:noFill/>
+                    <a:ln>
+                      <a:noFill/>
+                    </a:ln>
+                  </pic:spPr>
+                </pic:pic>
+              </a:graphicData>
+            </a:graphic>
+          </wp:inline>
+        </w:drawing>
+      </w:r>
+      <w:r>
+        <w:rPr>
+          <w:noProof/>
+        </w:rPr>
+        <w:tab/>
+      </w:r>
+      <w:r>
+        <w:rPr>
+          <w:noProof/>
+        </w:rPr>
+        <w:drawing>
+          <wp:inline distT="0" distB="0" distL="0" distR="0" wp14:anchorId="3228913A" wp14:editId="43BD441E">
+            <wp:extent cx="891540" cy="891540"/>
+            <wp:effectExtent l="0" t="0" r="3810" b="3810"/>
+            <wp:docPr id="2026642058" name="Picture 8"/>
+            <wp:cNvGraphicFramePr>
+              <a:graphicFrameLocks xmlns:a="http://schemas.openxmlformats.org/drawingml/2006/main" noChangeAspect="1"/>
+            </wp:cNvGraphicFramePr>
+            <a:graphic xmlns:a="http://schemas.openxmlformats.org/drawingml/2006/main">
+              <a:graphicData uri="http://schemas.openxmlformats.org/drawingml/2006/picture">
+                <pic:pic xmlns:pic="http://schemas.openxmlformats.org/drawingml/2006/picture">
+                  <pic:nvPicPr>
+                    <pic:cNvPr id="0" name="Picture 6"/>
+                    <pic:cNvPicPr>
+                      <a:picLocks noChangeAspect="1" noChangeArrowheads="1"/>
+                    </pic:cNvPicPr>
+                  </pic:nvPicPr>
+                  <pic:blipFill>
+                    <a:blip r:embed="rId7" cstate="print">
+                      <a:extLst>
+                        <a:ext uri="{28A0092B-C50C-407E-A947-70E740481C1C}">
+                          <a14:useLocalDpi xmlns:a14="http://schemas.microsoft.com/office/drawing/2010/main" val="0"/>
+                        </a:ext>
+                      </a:extLst>
+                    </a:blip>
+                    <a:srcRect/>
+                    <a:stretch>
+                      <a:fillRect/>
+                    </a:stretch>
+                  </pic:blipFill>
+                  <pic:spPr bwMode="auto">
+                    <a:xfrm>
+                      <a:off x="0" y="0"/>
+                      <a:ext cx="891540" cy="891540"/>
+                    </a:xfrm>
+                    <a:prstGeom prst="rect">
+                      <a:avLst/>
+                    </a:prstGeom>
+                    <a:noFill/>
+                    <a:ln>
+                      <a:noFill/>
+                    </a:ln>
+                  </pic:spPr>
+                </pic:pic>
+              </a:graphicData>
+            </a:graphic>
+          </wp:inline>
+        </w:drawing>
       </w:r>
     </w:p>
     <w:p>
@@ -1153,7 +1309,7 @@
         <mc:AlternateContent>
           <mc:Choice Requires="wpg">
             <w:drawing>
-              <wp:inline distT="0" distB="0" distL="0" distR="0" wp14:anchorId="4D18E2E8" wp14:editId="79460768">
+              <wp:inline distT="0" distB="0" distL="0" distR="0" wp14:anchorId="4D18E2E8" wp14:editId="1AEBE648">
                 <wp:extent cx="5173981" cy="1"/>
                 <wp:effectExtent l="0" t="0" r="0" b="0"/>
                 <wp:docPr id="1039" name="Group 1039"/>
@@ -1268,7 +1424,7 @@
           </mc:Choice>
           <mc:Fallback>
             <w:pict>
-              <v:group w14:anchorId="29CDA0FD" id="Group 1039" o:spid="_x0000_s1026" style="width:407.4pt;height:0;mso-position-horizontal-relative:char;mso-position-vertical-relative:line" coordsize="51739,0" o:gfxdata="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">
+              <v:group w14:anchorId="70E8E51E" id="Group 1039" o:spid="_x0000_s1026" style="width:407.4pt;height:0;mso-position-horizontal-relative:char;mso-position-vertical-relative:line" coordsize="51739,0" o:gfxdata="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">
                 <v:shape id="Shape 131" o:spid="_x0000_s1027" style="position:absolute;width:10515;height:0;visibility:visible;mso-wrap-style:square;v-text-anchor:top" coordsize="1051560,1" o:gfxdata="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" path="m,l1051560,1e" filled="f" strokeweight="1pt">
                   <v:stroke miterlimit="66585f" joinstyle="miter"/>
                   <v:path arrowok="t" textboxrect="0,0,1051560,1"/>
@@ -1329,16 +1485,6 @@
       <w:r>
         <w:tab/>
       </w:r>
-      <w:r>
-        <w:tab/>
-      </w:r>
-    </w:p>
-    <w:p>
-      <w:pPr>
-        <w:spacing w:after="160" w:line="259" w:lineRule="auto"/>
-        <w:ind w:left="0" w:firstLine="0"/>
-        <w:jc w:val="left"/>
-      </w:pPr>
       <w:r>
         <w:tab/>
       </w:r>

</xml_diff>